<commit_message>
Sync dataset with Power BI dashboard and update names
</commit_message>
<xml_diff>
--- a/E-Commerce_Project_Report.docx
+++ b/E-Commerce_Project_Report.docx
@@ -171,7 +171,7 @@
                                           <w:sz w:val="36"/>
                                           <w:szCs w:val="36"/>
                                         </w:rPr>
-                                        <w:t>ANMOL SHRIVASTAVA</w:t>
+                                        <w:t>VIVEK SHRIVASTAVA</w:t>
                                       </w:r>
                                     </w:p>
                                   </w:sdtContent>
@@ -383,7 +383,7 @@
                                     <w:sz w:val="36"/>
                                     <w:szCs w:val="36"/>
                                   </w:rPr>
-                                  <w:t>ANMOL SHRIVASTAVA</w:t>
+                                  <w:t>VIVEK SHRIVASTAVA</w:t>
                                 </w:r>
                               </w:p>
                             </w:sdtContent>

</xml_diff>